<commit_message>
feat: add LLM-as-a-Judge cross-validation to all docx generators
Updated 3 generator scripts and regenerated their .docx outputs:
- generate_intelligibility_methodology_docx.py: added Section 17
  (LLM Judge Gold Standard) with correlation tables, 3x5 confusion
  matrix, partial judgment analysis, cross-config stability
- generate_summary.py: added Section 1.4 (LLM-as-a-Judge
  Cross-Validation) with capture rate comparison and correlation
- generate_research_journal.py: added Section 15.6 (LLM Judge vs IS
  Correlation Analysis) with signal-level correlations, confusion
  matrix, and cross-config stability
</commit_message>
<xml_diff>
--- a/docs/evaluation/intelligibility_methodology.docx
+++ b/docs/evaluation/intelligibility_methodology.docx
@@ -122,7 +122,7 @@
           <w:color w:val="333333"/>
           <w:sz w:val="22"/>
         </w:rPr>
-        <w:t>February 25, 2026</w:t>
+        <w:t>March 03, 2026</w:t>
       </w:r>
     </w:p>
     <w:p>
@@ -254,6 +254,14 @@
           <w:sz w:val="20"/>
         </w:rPr>
         <w:t>7. The Composite Formula</w:t>
+        <w:br/>
+      </w:r>
+      <w:r>
+        <w:rPr>
+          <w:rFonts w:ascii="Calibri" w:hAnsi="Calibri"/>
+          <w:sz w:val="20"/>
+        </w:rPr>
+        <w:t>17. LLM-as-a-Judge Cross-Validation of IS Framework</w:t>
         <w:br/>
       </w:r>
       <w:r>
@@ -3274,7 +3282,21 @@
           <w:rFonts w:ascii="Calibri" w:hAnsi="Calibri"/>
           <w:color w:val="1A3A5C"/>
         </w:rPr>
-        <w:t>4. Claude’s Assessment Process</w:t>
+        <w:t>4. Claude’s Assessment Process (Design-Time Only)</w:t>
+      </w:r>
+    </w:p>
+    <w:p>
+      <w:pPr>
+        <w:spacing w:after="80"/>
+      </w:pPr>
+      <w:r>
+        <w:rPr>
+          <w:rFonts w:ascii="Calibri" w:hAnsi="Calibri"/>
+          <w:b w:val="0"/>
+          <w:i w:val="0"/>
+          <w:sz w:val="20"/>
+        </w:rPr>
+        <w:t>Clarification: The 5-step process below describes how Claude (Anthropic) designed the evaluation rubric at design time — not a per-sample runtime process. The resulting IS formula and llm_context_prob decision tree are fully deterministic Python code with zero LLM API calls. Evaluating all 1,497 segments takes seconds of local computation and costs $0.</w:t>
       </w:r>
     </w:p>
     <w:p>
@@ -4828,6 +4850,2435 @@
         <w:t>These are the segments where a human could understand what was actually said from the lip-reading output.</w:t>
       </w:r>
     </w:p>
+    <w:p>
+      <w:r>
+        <w:br w:type="page"/>
+      </w:r>
+    </w:p>
+    <w:p>
+      <w:pPr>
+        <w:pStyle w:val="Heading1"/>
+      </w:pPr>
+      <w:r>
+        <w:rPr>
+          <w:rFonts w:ascii="Calibri" w:hAnsi="Calibri"/>
+          <w:color w:val="1A3A5C"/>
+        </w:rPr>
+        <w:t>17. LLM-as-a-Judge Cross-Validation of IS Framework</w:t>
+      </w:r>
+    </w:p>
+    <w:p>
+      <w:pPr>
+        <w:spacing w:after="80"/>
+      </w:pPr>
+      <w:r>
+        <w:rPr>
+          <w:rFonts w:ascii="Calibri" w:hAnsi="Calibri"/>
+          <w:b w:val="0"/>
+          <w:i w:val="0"/>
+          <w:sz w:val="20"/>
+        </w:rPr>
+        <w:t>To validate the IS framework against actual language understanding, Claude Opus 4.6 evaluated all 1,497 hypothesis-reference pairs using holistic LLM reasoning. The evaluation was blind (no metrics visible), used a 3-level scale (Y/P/N), and included 30 duplicate pairs for intra-rater reliability (86.7% exact agreement).</w:t>
+      </w:r>
+    </w:p>
+    <w:p>
+      <w:pPr>
+        <w:pStyle w:val="Heading2"/>
+      </w:pPr>
+      <w:r>
+        <w:rPr>
+          <w:rFonts w:ascii="Calibri" w:hAnsi="Calibri"/>
+          <w:color w:val="2A5A8C"/>
+        </w:rPr>
+        <w:t>17.1 Results</w:t>
+      </w:r>
+    </w:p>
+    <w:tbl>
+      <w:tblPr>
+        <w:tblStyle w:val="TableGrid"/>
+        <w:tblW w:type="auto" w:w="0"/>
+        <w:jc w:val="center"/>
+        <w:tblLook w:firstColumn="1" w:firstRow="1" w:lastColumn="0" w:lastRow="0" w:noHBand="0" w:noVBand="1" w:val="04A0"/>
+      </w:tblPr>
+      <w:tblGrid>
+        <w:gridCol w:w="3024"/>
+        <w:gridCol w:w="3024"/>
+        <w:gridCol w:w="3024"/>
+      </w:tblGrid>
+      <w:tr>
+        <w:tc>
+          <w:tcPr>
+            <w:tcW w:type="dxa" w:w="4320"/>
+            <w:shd w:fill="1a3a5c"/>
+          </w:tcPr>
+          <w:p>
+            <w:r/>
+            <w:r>
+              <w:rPr>
+                <w:rFonts w:ascii="Calibri" w:hAnsi="Calibri"/>
+                <w:b/>
+                <w:color w:val="FFFFFF"/>
+                <w:sz w:val="16"/>
+              </w:rPr>
+              <w:t>Judgment</w:t>
+            </w:r>
+          </w:p>
+        </w:tc>
+        <w:tc>
+          <w:tcPr>
+            <w:tcW w:type="dxa" w:w="1440"/>
+            <w:shd w:fill="1a3a5c"/>
+          </w:tcPr>
+          <w:p>
+            <w:r/>
+            <w:r>
+              <w:rPr>
+                <w:rFonts w:ascii="Calibri" w:hAnsi="Calibri"/>
+                <w:b/>
+                <w:color w:val="FFFFFF"/>
+                <w:sz w:val="16"/>
+              </w:rPr>
+              <w:t>Count</w:t>
+            </w:r>
+          </w:p>
+        </w:tc>
+        <w:tc>
+          <w:tcPr>
+            <w:tcW w:type="dxa" w:w="1440"/>
+            <w:shd w:fill="1a3a5c"/>
+          </w:tcPr>
+          <w:p>
+            <w:r/>
+            <w:r>
+              <w:rPr>
+                <w:rFonts w:ascii="Calibri" w:hAnsi="Calibri"/>
+                <w:b/>
+                <w:color w:val="FFFFFF"/>
+                <w:sz w:val="16"/>
+              </w:rPr>
+              <w:t>Rate</w:t>
+            </w:r>
+          </w:p>
+        </w:tc>
+      </w:tr>
+      <w:tr>
+        <w:tc>
+          <w:tcPr>
+            <w:tcW w:type="dxa" w:w="4320"/>
+          </w:tcPr>
+          <w:p>
+            <w:r/>
+            <w:r>
+              <w:rPr>
+                <w:rFonts w:ascii="Calibri" w:hAnsi="Calibri"/>
+                <w:b w:val="0"/>
+                <w:sz w:val="16"/>
+              </w:rPr>
+              <w:t>Y (meaning clearly conveyed)</w:t>
+            </w:r>
+          </w:p>
+        </w:tc>
+        <w:tc>
+          <w:tcPr>
+            <w:tcW w:type="dxa" w:w="1440"/>
+          </w:tcPr>
+          <w:p>
+            <w:r/>
+            <w:r>
+              <w:rPr>
+                <w:rFonts w:ascii="Calibri" w:hAnsi="Calibri"/>
+                <w:b w:val="0"/>
+                <w:sz w:val="16"/>
+              </w:rPr>
+              <w:t>345</w:t>
+            </w:r>
+          </w:p>
+        </w:tc>
+        <w:tc>
+          <w:tcPr>
+            <w:tcW w:type="dxa" w:w="1440"/>
+          </w:tcPr>
+          <w:p>
+            <w:r/>
+            <w:r>
+              <w:rPr>
+                <w:rFonts w:ascii="Calibri" w:hAnsi="Calibri"/>
+                <w:b w:val="0"/>
+                <w:sz w:val="16"/>
+              </w:rPr>
+              <w:t>23.0%</w:t>
+            </w:r>
+          </w:p>
+        </w:tc>
+      </w:tr>
+      <w:tr>
+        <w:tc>
+          <w:tcPr>
+            <w:tcW w:type="dxa" w:w="4320"/>
+            <w:shd w:fill="f0f4f8"/>
+          </w:tcPr>
+          <w:p>
+            <w:r/>
+            <w:r>
+              <w:rPr>
+                <w:rFonts w:ascii="Calibri" w:hAnsi="Calibri"/>
+                <w:b w:val="0"/>
+                <w:sz w:val="16"/>
+              </w:rPr>
+              <w:t>P (partial — some meaning preserved)</w:t>
+            </w:r>
+          </w:p>
+        </w:tc>
+        <w:tc>
+          <w:tcPr>
+            <w:tcW w:type="dxa" w:w="1440"/>
+            <w:shd w:fill="f0f4f8"/>
+          </w:tcPr>
+          <w:p>
+            <w:r/>
+            <w:r>
+              <w:rPr>
+                <w:rFonts w:ascii="Calibri" w:hAnsi="Calibri"/>
+                <w:b w:val="0"/>
+                <w:sz w:val="16"/>
+              </w:rPr>
+              <w:t>626</w:t>
+            </w:r>
+          </w:p>
+        </w:tc>
+        <w:tc>
+          <w:tcPr>
+            <w:tcW w:type="dxa" w:w="1440"/>
+            <w:shd w:fill="f0f4f8"/>
+          </w:tcPr>
+          <w:p>
+            <w:r/>
+            <w:r>
+              <w:rPr>
+                <w:rFonts w:ascii="Calibri" w:hAnsi="Calibri"/>
+                <w:b w:val="0"/>
+                <w:sz w:val="16"/>
+              </w:rPr>
+              <w:t>41.8%</w:t>
+            </w:r>
+          </w:p>
+        </w:tc>
+      </w:tr>
+      <w:tr>
+        <w:tc>
+          <w:tcPr>
+            <w:tcW w:type="dxa" w:w="4320"/>
+          </w:tcPr>
+          <w:p>
+            <w:r/>
+            <w:r>
+              <w:rPr>
+                <w:rFonts w:ascii="Calibri" w:hAnsi="Calibri"/>
+                <w:b w:val="0"/>
+                <w:sz w:val="16"/>
+              </w:rPr>
+              <w:t>N (meaning lost)</w:t>
+            </w:r>
+          </w:p>
+        </w:tc>
+        <w:tc>
+          <w:tcPr>
+            <w:tcW w:type="dxa" w:w="1440"/>
+          </w:tcPr>
+          <w:p>
+            <w:r/>
+            <w:r>
+              <w:rPr>
+                <w:rFonts w:ascii="Calibri" w:hAnsi="Calibri"/>
+                <w:b w:val="0"/>
+                <w:sz w:val="16"/>
+              </w:rPr>
+              <w:t>526</w:t>
+            </w:r>
+          </w:p>
+        </w:tc>
+        <w:tc>
+          <w:tcPr>
+            <w:tcW w:type="dxa" w:w="1440"/>
+          </w:tcPr>
+          <w:p>
+            <w:r/>
+            <w:r>
+              <w:rPr>
+                <w:rFonts w:ascii="Calibri" w:hAnsi="Calibri"/>
+                <w:b w:val="0"/>
+                <w:sz w:val="16"/>
+              </w:rPr>
+              <w:t>35.1%</w:t>
+            </w:r>
+          </w:p>
+        </w:tc>
+      </w:tr>
+      <w:tr>
+        <w:tc>
+          <w:tcPr>
+            <w:tcW w:type="dxa" w:w="4320"/>
+            <w:shd w:fill="f0f4f8"/>
+          </w:tcPr>
+          <w:p>
+            <w:r/>
+            <w:r>
+              <w:rPr>
+                <w:rFonts w:ascii="Calibri" w:hAnsi="Calibri"/>
+                <w:b w:val="0"/>
+                <w:sz w:val="16"/>
+              </w:rPr>
+              <w:t>Y+P (any useful output)</w:t>
+            </w:r>
+          </w:p>
+        </w:tc>
+        <w:tc>
+          <w:tcPr>
+            <w:tcW w:type="dxa" w:w="1440"/>
+            <w:shd w:fill="f0f4f8"/>
+          </w:tcPr>
+          <w:p>
+            <w:r/>
+            <w:r>
+              <w:rPr>
+                <w:rFonts w:ascii="Calibri" w:hAnsi="Calibri"/>
+                <w:b w:val="0"/>
+                <w:sz w:val="16"/>
+              </w:rPr>
+              <w:t>971</w:t>
+            </w:r>
+          </w:p>
+        </w:tc>
+        <w:tc>
+          <w:tcPr>
+            <w:tcW w:type="dxa" w:w="1440"/>
+            <w:shd w:fill="f0f4f8"/>
+          </w:tcPr>
+          <w:p>
+            <w:r/>
+            <w:r>
+              <w:rPr>
+                <w:rFonts w:ascii="Calibri" w:hAnsi="Calibri"/>
+                <w:b w:val="0"/>
+                <w:sz w:val="16"/>
+              </w:rPr>
+              <w:t>64.9%</w:t>
+            </w:r>
+          </w:p>
+        </w:tc>
+      </w:tr>
+    </w:tbl>
+    <w:p/>
+    <w:p>
+      <w:pPr>
+        <w:pStyle w:val="Heading2"/>
+      </w:pPr>
+      <w:r>
+        <w:rPr>
+          <w:rFonts w:ascii="Calibri" w:hAnsi="Calibri"/>
+          <w:color w:val="2A5A8C"/>
+        </w:rPr>
+        <w:t>17.2 Correlation with IS Signals</w:t>
+      </w:r>
+    </w:p>
+    <w:p>
+      <w:pPr>
+        <w:spacing w:after="80"/>
+      </w:pPr>
+      <w:r>
+        <w:rPr>
+          <w:rFonts w:ascii="Calibri" w:hAnsi="Calibri"/>
+          <w:b w:val="0"/>
+          <w:i w:val="0"/>
+          <w:sz w:val="20"/>
+        </w:rPr>
+        <w:t>The LLM judge ratings correlate strongly with IS and its component signals:</w:t>
+      </w:r>
+    </w:p>
+    <w:tbl>
+      <w:tblPr>
+        <w:tblStyle w:val="TableGrid"/>
+        <w:tblW w:type="auto" w:w="0"/>
+        <w:jc w:val="center"/>
+        <w:tblLook w:firstColumn="1" w:firstRow="1" w:lastColumn="0" w:lastRow="0" w:noHBand="0" w:noVBand="1" w:val="04A0"/>
+      </w:tblPr>
+      <w:tblGrid>
+        <w:gridCol w:w="3024"/>
+        <w:gridCol w:w="3024"/>
+        <w:gridCol w:w="3024"/>
+      </w:tblGrid>
+      <w:tr>
+        <w:tc>
+          <w:tcPr>
+            <w:tcW w:type="dxa" w:w="3600"/>
+            <w:shd w:fill="1a3a5c"/>
+          </w:tcPr>
+          <w:p>
+            <w:r/>
+            <w:r>
+              <w:rPr>
+                <w:rFonts w:ascii="Calibri" w:hAnsi="Calibri"/>
+                <w:b/>
+                <w:color w:val="FFFFFF"/>
+                <w:sz w:val="16"/>
+              </w:rPr>
+              <w:t>Signal</w:t>
+            </w:r>
+          </w:p>
+        </w:tc>
+        <w:tc>
+          <w:tcPr>
+            <w:tcW w:type="dxa" w:w="1440"/>
+            <w:shd w:fill="1a3a5c"/>
+          </w:tcPr>
+          <w:p>
+            <w:r/>
+            <w:r>
+              <w:rPr>
+                <w:rFonts w:ascii="Calibri" w:hAnsi="Calibri"/>
+                <w:b/>
+                <w:color w:val="FFFFFF"/>
+                <w:sz w:val="16"/>
+              </w:rPr>
+              <w:t>Pearson r</w:t>
+            </w:r>
+          </w:p>
+        </w:tc>
+        <w:tc>
+          <w:tcPr>
+            <w:tcW w:type="dxa" w:w="1440"/>
+            <w:shd w:fill="1a3a5c"/>
+          </w:tcPr>
+          <w:p>
+            <w:r/>
+            <w:r>
+              <w:rPr>
+                <w:rFonts w:ascii="Calibri" w:hAnsi="Calibri"/>
+                <w:b/>
+                <w:color w:val="FFFFFF"/>
+                <w:sz w:val="16"/>
+              </w:rPr>
+              <w:t>Spearman ρ</w:t>
+            </w:r>
+          </w:p>
+        </w:tc>
+      </w:tr>
+      <w:tr>
+        <w:tc>
+          <w:tcPr>
+            <w:tcW w:type="dxa" w:w="3600"/>
+          </w:tcPr>
+          <w:p>
+            <w:r/>
+            <w:r>
+              <w:rPr>
+                <w:rFonts w:ascii="Calibri" w:hAnsi="Calibri"/>
+                <w:b w:val="0"/>
+                <w:sz w:val="16"/>
+              </w:rPr>
+              <w:t>Intelligibility Score (IS)</w:t>
+            </w:r>
+          </w:p>
+        </w:tc>
+        <w:tc>
+          <w:tcPr>
+            <w:tcW w:type="dxa" w:w="1440"/>
+          </w:tcPr>
+          <w:p>
+            <w:r/>
+            <w:r>
+              <w:rPr>
+                <w:rFonts w:ascii="Calibri" w:hAnsi="Calibri"/>
+                <w:b w:val="0"/>
+                <w:sz w:val="16"/>
+              </w:rPr>
+              <w:t>0.850</w:t>
+            </w:r>
+          </w:p>
+        </w:tc>
+        <w:tc>
+          <w:tcPr>
+            <w:tcW w:type="dxa" w:w="1440"/>
+          </w:tcPr>
+          <w:p>
+            <w:r/>
+            <w:r>
+              <w:rPr>
+                <w:rFonts w:ascii="Calibri" w:hAnsi="Calibri"/>
+                <w:b w:val="0"/>
+                <w:sz w:val="16"/>
+              </w:rPr>
+              <w:t>0.858</w:t>
+            </w:r>
+          </w:p>
+        </w:tc>
+      </w:tr>
+      <w:tr>
+        <w:tc>
+          <w:tcPr>
+            <w:tcW w:type="dxa" w:w="3600"/>
+            <w:shd w:fill="f0f4f8"/>
+          </w:tcPr>
+          <w:p>
+            <w:r/>
+            <w:r>
+              <w:rPr>
+                <w:rFonts w:ascii="Calibri" w:hAnsi="Calibri"/>
+                <w:b w:val="0"/>
+                <w:sz w:val="16"/>
+              </w:rPr>
+              <w:t>Semantic Similarity</w:t>
+            </w:r>
+          </w:p>
+        </w:tc>
+        <w:tc>
+          <w:tcPr>
+            <w:tcW w:type="dxa" w:w="1440"/>
+            <w:shd w:fill="f0f4f8"/>
+          </w:tcPr>
+          <w:p>
+            <w:r/>
+            <w:r>
+              <w:rPr>
+                <w:rFonts w:ascii="Calibri" w:hAnsi="Calibri"/>
+                <w:b w:val="0"/>
+                <w:sz w:val="16"/>
+              </w:rPr>
+              <w:t>0.680</w:t>
+            </w:r>
+          </w:p>
+        </w:tc>
+        <w:tc>
+          <w:tcPr>
+            <w:tcW w:type="dxa" w:w="1440"/>
+            <w:shd w:fill="f0f4f8"/>
+          </w:tcPr>
+          <w:p>
+            <w:r/>
+            <w:r>
+              <w:rPr>
+                <w:rFonts w:ascii="Calibri" w:hAnsi="Calibri"/>
+                <w:b w:val="0"/>
+                <w:sz w:val="16"/>
+              </w:rPr>
+              <w:t>0.679</w:t>
+            </w:r>
+          </w:p>
+        </w:tc>
+      </w:tr>
+      <w:tr>
+        <w:tc>
+          <w:tcPr>
+            <w:tcW w:type="dxa" w:w="3600"/>
+          </w:tcPr>
+          <w:p>
+            <w:r/>
+            <w:r>
+              <w:rPr>
+                <w:rFonts w:ascii="Calibri" w:hAnsi="Calibri"/>
+                <w:b w:val="0"/>
+                <w:sz w:val="16"/>
+              </w:rPr>
+              <w:t>Inverse WER</w:t>
+            </w:r>
+          </w:p>
+        </w:tc>
+        <w:tc>
+          <w:tcPr>
+            <w:tcW w:type="dxa" w:w="1440"/>
+          </w:tcPr>
+          <w:p>
+            <w:r/>
+            <w:r>
+              <w:rPr>
+                <w:rFonts w:ascii="Calibri" w:hAnsi="Calibri"/>
+                <w:b w:val="0"/>
+                <w:sz w:val="16"/>
+              </w:rPr>
+              <w:t>0.619</w:t>
+            </w:r>
+          </w:p>
+        </w:tc>
+        <w:tc>
+          <w:tcPr>
+            <w:tcW w:type="dxa" w:w="1440"/>
+          </w:tcPr>
+          <w:p>
+            <w:r/>
+            <w:r>
+              <w:rPr>
+                <w:rFonts w:ascii="Calibri" w:hAnsi="Calibri"/>
+                <w:b w:val="0"/>
+                <w:sz w:val="16"/>
+              </w:rPr>
+              <w:t>0.626</w:t>
+            </w:r>
+          </w:p>
+        </w:tc>
+      </w:tr>
+      <w:tr>
+        <w:tc>
+          <w:tcPr>
+            <w:tcW w:type="dxa" w:w="3600"/>
+            <w:shd w:fill="f0f4f8"/>
+          </w:tcPr>
+          <w:p>
+            <w:r/>
+            <w:r>
+              <w:rPr>
+                <w:rFonts w:ascii="Calibri" w:hAnsi="Calibri"/>
+                <w:b w:val="0"/>
+                <w:sz w:val="16"/>
+              </w:rPr>
+              <w:t>Inverse WWER</w:t>
+            </w:r>
+          </w:p>
+        </w:tc>
+        <w:tc>
+          <w:tcPr>
+            <w:tcW w:type="dxa" w:w="1440"/>
+            <w:shd w:fill="f0f4f8"/>
+          </w:tcPr>
+          <w:p>
+            <w:r/>
+            <w:r>
+              <w:rPr>
+                <w:rFonts w:ascii="Calibri" w:hAnsi="Calibri"/>
+                <w:b w:val="0"/>
+                <w:sz w:val="16"/>
+              </w:rPr>
+              <w:t>0.614</w:t>
+            </w:r>
+          </w:p>
+        </w:tc>
+        <w:tc>
+          <w:tcPr>
+            <w:tcW w:type="dxa" w:w="1440"/>
+            <w:shd w:fill="f0f4f8"/>
+          </w:tcPr>
+          <w:p>
+            <w:r/>
+            <w:r>
+              <w:rPr>
+                <w:rFonts w:ascii="Calibri" w:hAnsi="Calibri"/>
+                <w:b w:val="0"/>
+                <w:sz w:val="16"/>
+              </w:rPr>
+              <w:t>0.622</w:t>
+            </w:r>
+          </w:p>
+        </w:tc>
+      </w:tr>
+      <w:tr>
+        <w:tc>
+          <w:tcPr>
+            <w:tcW w:type="dxa" w:w="3600"/>
+          </w:tcPr>
+          <w:p>
+            <w:r/>
+            <w:r>
+              <w:rPr>
+                <w:rFonts w:ascii="Calibri" w:hAnsi="Calibri"/>
+                <w:b w:val="0"/>
+                <w:sz w:val="16"/>
+              </w:rPr>
+              <w:t>Phonetic Similarity</w:t>
+            </w:r>
+          </w:p>
+        </w:tc>
+        <w:tc>
+          <w:tcPr>
+            <w:tcW w:type="dxa" w:w="1440"/>
+          </w:tcPr>
+          <w:p>
+            <w:r/>
+            <w:r>
+              <w:rPr>
+                <w:rFonts w:ascii="Calibri" w:hAnsi="Calibri"/>
+                <w:b w:val="0"/>
+                <w:sz w:val="16"/>
+              </w:rPr>
+              <w:t>0.549</w:t>
+            </w:r>
+          </w:p>
+        </w:tc>
+        <w:tc>
+          <w:tcPr>
+            <w:tcW w:type="dxa" w:w="1440"/>
+          </w:tcPr>
+          <w:p>
+            <w:r/>
+            <w:r>
+              <w:rPr>
+                <w:rFonts w:ascii="Calibri" w:hAnsi="Calibri"/>
+                <w:b w:val="0"/>
+                <w:sz w:val="16"/>
+              </w:rPr>
+              <w:t>0.555</w:t>
+            </w:r>
+          </w:p>
+        </w:tc>
+      </w:tr>
+      <w:tr>
+        <w:tc>
+          <w:tcPr>
+            <w:tcW w:type="dxa" w:w="3600"/>
+            <w:shd w:fill="f0f4f8"/>
+          </w:tcPr>
+          <w:p>
+            <w:r/>
+            <w:r>
+              <w:rPr>
+                <w:rFonts w:ascii="Calibri" w:hAnsi="Calibri"/>
+                <w:b w:val="0"/>
+                <w:sz w:val="16"/>
+              </w:rPr>
+              <w:t>NEA F1</w:t>
+            </w:r>
+          </w:p>
+        </w:tc>
+        <w:tc>
+          <w:tcPr>
+            <w:tcW w:type="dxa" w:w="1440"/>
+            <w:shd w:fill="f0f4f8"/>
+          </w:tcPr>
+          <w:p>
+            <w:r/>
+            <w:r>
+              <w:rPr>
+                <w:rFonts w:ascii="Calibri" w:hAnsi="Calibri"/>
+                <w:b w:val="0"/>
+                <w:sz w:val="16"/>
+              </w:rPr>
+              <w:t>0.493</w:t>
+            </w:r>
+          </w:p>
+        </w:tc>
+        <w:tc>
+          <w:tcPr>
+            <w:tcW w:type="dxa" w:w="1440"/>
+            <w:shd w:fill="f0f4f8"/>
+          </w:tcPr>
+          <w:p>
+            <w:r/>
+            <w:r>
+              <w:rPr>
+                <w:rFonts w:ascii="Calibri" w:hAnsi="Calibri"/>
+                <w:b w:val="0"/>
+                <w:sz w:val="16"/>
+              </w:rPr>
+              <w:t>0.512</w:t>
+            </w:r>
+          </w:p>
+        </w:tc>
+      </w:tr>
+      <w:tr>
+        <w:tc>
+          <w:tcPr>
+            <w:tcW w:type="dxa" w:w="3600"/>
+          </w:tcPr>
+          <w:p>
+            <w:r/>
+            <w:r>
+              <w:rPr>
+                <w:rFonts w:ascii="Calibri" w:hAnsi="Calibri"/>
+                <w:b w:val="0"/>
+                <w:sz w:val="16"/>
+              </w:rPr>
+              <w:t>Length Ratio</w:t>
+            </w:r>
+          </w:p>
+        </w:tc>
+        <w:tc>
+          <w:tcPr>
+            <w:tcW w:type="dxa" w:w="1440"/>
+          </w:tcPr>
+          <w:p>
+            <w:r/>
+            <w:r>
+              <w:rPr>
+                <w:rFonts w:ascii="Calibri" w:hAnsi="Calibri"/>
+                <w:b w:val="0"/>
+                <w:sz w:val="16"/>
+              </w:rPr>
+              <w:t>0.415</w:t>
+            </w:r>
+          </w:p>
+        </w:tc>
+        <w:tc>
+          <w:tcPr>
+            <w:tcW w:type="dxa" w:w="1440"/>
+          </w:tcPr>
+          <w:p>
+            <w:r/>
+            <w:r>
+              <w:rPr>
+                <w:rFonts w:ascii="Calibri" w:hAnsi="Calibri"/>
+                <w:b w:val="0"/>
+                <w:sz w:val="16"/>
+              </w:rPr>
+              <w:t>0.408</w:t>
+            </w:r>
+          </w:p>
+        </w:tc>
+      </w:tr>
+    </w:tbl>
+    <w:p/>
+    <w:p>
+      <w:pPr>
+        <w:spacing w:after="80"/>
+      </w:pPr>
+      <w:r>
+        <w:rPr>
+          <w:rFonts w:ascii="Calibri" w:hAnsi="Calibri"/>
+          <w:b w:val="0"/>
+          <w:i w:val="0"/>
+          <w:sz w:val="20"/>
+        </w:rPr>
+        <w:t>IS achieves the highest correlation (r = 0.850) because it combines all six signals — no single signal alone captures what the LLM judge measures. Semantic similarity is the strongest individual signal (r = 0.680), confirming IS’s 25% semantic weight is appropriate.</w:t>
+      </w:r>
+    </w:p>
+    <w:p>
+      <w:pPr>
+        <w:pStyle w:val="Heading2"/>
+      </w:pPr>
+      <w:r>
+        <w:rPr>
+          <w:rFonts w:ascii="Calibri" w:hAnsi="Calibri"/>
+          <w:color w:val="2A5A8C"/>
+        </w:rPr>
+        <w:t>17.3 Agreement with IS ≥ 3.0 Threshold</w:t>
+      </w:r>
+    </w:p>
+    <w:tbl>
+      <w:tblPr>
+        <w:tblStyle w:val="TableGrid"/>
+        <w:tblW w:type="auto" w:w="0"/>
+        <w:jc w:val="center"/>
+        <w:tblLook w:firstColumn="1" w:firstRow="1" w:lastColumn="0" w:lastRow="0" w:noHBand="0" w:noVBand="1" w:val="04A0"/>
+      </w:tblPr>
+      <w:tblGrid>
+        <w:gridCol w:w="1814"/>
+        <w:gridCol w:w="1814"/>
+        <w:gridCol w:w="1814"/>
+        <w:gridCol w:w="1814"/>
+        <w:gridCol w:w="1814"/>
+      </w:tblGrid>
+      <w:tr>
+        <w:tc>
+          <w:tcPr>
+            <w:tcW w:type="dxa" w:w="3600"/>
+            <w:shd w:fill="1a3a5c"/>
+          </w:tcPr>
+          <w:p>
+            <w:r/>
+            <w:r>
+              <w:rPr>
+                <w:rFonts w:ascii="Calibri" w:hAnsi="Calibri"/>
+                <w:b/>
+                <w:color w:val="FFFFFF"/>
+                <w:sz w:val="16"/>
+              </w:rPr>
+              <w:t>Comparison</w:t>
+            </w:r>
+          </w:p>
+        </w:tc>
+        <w:tc>
+          <w:tcPr>
+            <w:tcW w:type="dxa" w:w="864"/>
+            <w:shd w:fill="1a3a5c"/>
+          </w:tcPr>
+          <w:p>
+            <w:r/>
+            <w:r>
+              <w:rPr>
+                <w:rFonts w:ascii="Calibri" w:hAnsi="Calibri"/>
+                <w:b/>
+                <w:color w:val="FFFFFF"/>
+                <w:sz w:val="16"/>
+              </w:rPr>
+              <w:t>κ</w:t>
+            </w:r>
+          </w:p>
+        </w:tc>
+        <w:tc>
+          <w:tcPr>
+            <w:tcW w:type="dxa" w:w="1008"/>
+            <w:shd w:fill="1a3a5c"/>
+          </w:tcPr>
+          <w:p>
+            <w:r/>
+            <w:r>
+              <w:rPr>
+                <w:rFonts w:ascii="Calibri" w:hAnsi="Calibri"/>
+                <w:b/>
+                <w:color w:val="FFFFFF"/>
+                <w:sz w:val="16"/>
+              </w:rPr>
+              <w:t>Accuracy</w:t>
+            </w:r>
+          </w:p>
+        </w:tc>
+        <w:tc>
+          <w:tcPr>
+            <w:tcW w:type="dxa" w:w="1008"/>
+            <w:shd w:fill="1a3a5c"/>
+          </w:tcPr>
+          <w:p>
+            <w:r/>
+            <w:r>
+              <w:rPr>
+                <w:rFonts w:ascii="Calibri" w:hAnsi="Calibri"/>
+                <w:b/>
+                <w:color w:val="FFFFFF"/>
+                <w:sz w:val="16"/>
+              </w:rPr>
+              <w:t>Precision</w:t>
+            </w:r>
+          </w:p>
+        </w:tc>
+        <w:tc>
+          <w:tcPr>
+            <w:tcW w:type="dxa" w:w="864"/>
+            <w:shd w:fill="1a3a5c"/>
+          </w:tcPr>
+          <w:p>
+            <w:r/>
+            <w:r>
+              <w:rPr>
+                <w:rFonts w:ascii="Calibri" w:hAnsi="Calibri"/>
+                <w:b/>
+                <w:color w:val="FFFFFF"/>
+                <w:sz w:val="16"/>
+              </w:rPr>
+              <w:t>Recall</w:t>
+            </w:r>
+          </w:p>
+        </w:tc>
+      </w:tr>
+      <w:tr>
+        <w:tc>
+          <w:tcPr>
+            <w:tcW w:type="dxa" w:w="3600"/>
+          </w:tcPr>
+          <w:p>
+            <w:r/>
+            <w:r>
+              <w:rPr>
+                <w:rFonts w:ascii="Calibri" w:hAnsi="Calibri"/>
+                <w:b w:val="0"/>
+                <w:sz w:val="16"/>
+              </w:rPr>
+              <w:t>LLM Y vs IS ≥ 3.0 (strict)</w:t>
+            </w:r>
+          </w:p>
+        </w:tc>
+        <w:tc>
+          <w:tcPr>
+            <w:tcW w:type="dxa" w:w="864"/>
+          </w:tcPr>
+          <w:p>
+            <w:r/>
+            <w:r>
+              <w:rPr>
+                <w:rFonts w:ascii="Calibri" w:hAnsi="Calibri"/>
+                <w:b w:val="0"/>
+                <w:sz w:val="16"/>
+              </w:rPr>
+              <w:t>0.565</w:t>
+            </w:r>
+          </w:p>
+        </w:tc>
+        <w:tc>
+          <w:tcPr>
+            <w:tcW w:type="dxa" w:w="1008"/>
+          </w:tcPr>
+          <w:p>
+            <w:r/>
+            <w:r>
+              <w:rPr>
+                <w:rFonts w:ascii="Calibri" w:hAnsi="Calibri"/>
+                <w:b w:val="0"/>
+                <w:sz w:val="16"/>
+              </w:rPr>
+              <w:t>80.6%</w:t>
+            </w:r>
+          </w:p>
+        </w:tc>
+        <w:tc>
+          <w:tcPr>
+            <w:tcW w:type="dxa" w:w="1008"/>
+          </w:tcPr>
+          <w:p>
+            <w:r/>
+            <w:r>
+              <w:rPr>
+                <w:rFonts w:ascii="Calibri" w:hAnsi="Calibri"/>
+                <w:b w:val="0"/>
+                <w:sz w:val="16"/>
+              </w:rPr>
+              <w:t>94.5%</w:t>
+            </w:r>
+          </w:p>
+        </w:tc>
+        <w:tc>
+          <w:tcPr>
+            <w:tcW w:type="dxa" w:w="864"/>
+          </w:tcPr>
+          <w:p>
+            <w:r/>
+            <w:r>
+              <w:rPr>
+                <w:rFonts w:ascii="Calibri" w:hAnsi="Calibri"/>
+                <w:b w:val="0"/>
+                <w:sz w:val="16"/>
+              </w:rPr>
+              <w:t>54.6%</w:t>
+            </w:r>
+          </w:p>
+        </w:tc>
+      </w:tr>
+      <w:tr>
+        <w:tc>
+          <w:tcPr>
+            <w:tcW w:type="dxa" w:w="3600"/>
+            <w:shd w:fill="f0f4f8"/>
+          </w:tcPr>
+          <w:p>
+            <w:r/>
+            <w:r>
+              <w:rPr>
+                <w:rFonts w:ascii="Calibri" w:hAnsi="Calibri"/>
+                <w:b w:val="0"/>
+                <w:sz w:val="16"/>
+              </w:rPr>
+              <w:t>LLM Y+P vs IS ≥ 3.0 (lenient)</w:t>
+            </w:r>
+          </w:p>
+        </w:tc>
+        <w:tc>
+          <w:tcPr>
+            <w:tcW w:type="dxa" w:w="864"/>
+            <w:shd w:fill="f0f4f8"/>
+          </w:tcPr>
+          <w:p>
+            <w:r/>
+            <w:r>
+              <w:rPr>
+                <w:rFonts w:ascii="Calibri" w:hAnsi="Calibri"/>
+                <w:b w:val="0"/>
+                <w:sz w:val="16"/>
+              </w:rPr>
+              <w:t>0.521</w:t>
+            </w:r>
+          </w:p>
+        </w:tc>
+        <w:tc>
+          <w:tcPr>
+            <w:tcW w:type="dxa" w:w="1008"/>
+            <w:shd w:fill="f0f4f8"/>
+          </w:tcPr>
+          <w:p>
+            <w:r/>
+            <w:r>
+              <w:rPr>
+                <w:rFonts w:ascii="Calibri" w:hAnsi="Calibri"/>
+                <w:b w:val="0"/>
+                <w:sz w:val="16"/>
+              </w:rPr>
+              <w:t>74.6%</w:t>
+            </w:r>
+          </w:p>
+        </w:tc>
+        <w:tc>
+          <w:tcPr>
+            <w:tcW w:type="dxa" w:w="1008"/>
+            <w:shd w:fill="f0f4f8"/>
+          </w:tcPr>
+          <w:p>
+            <w:r/>
+            <w:r>
+              <w:rPr>
+                <w:rFonts w:ascii="Calibri" w:hAnsi="Calibri"/>
+                <w:b w:val="0"/>
+                <w:sz w:val="16"/>
+              </w:rPr>
+              <w:t>61.2%</w:t>
+            </w:r>
+          </w:p>
+        </w:tc>
+        <w:tc>
+          <w:tcPr>
+            <w:tcW w:type="dxa" w:w="864"/>
+            <w:shd w:fill="f0f4f8"/>
+          </w:tcPr>
+          <w:p>
+            <w:r/>
+            <w:r>
+              <w:rPr>
+                <w:rFonts w:ascii="Calibri" w:hAnsi="Calibri"/>
+                <w:b w:val="0"/>
+                <w:sz w:val="16"/>
+              </w:rPr>
+              <w:t>99.5%</w:t>
+            </w:r>
+          </w:p>
+        </w:tc>
+      </w:tr>
+    </w:tbl>
+    <w:p/>
+    <w:p>
+      <w:pPr>
+        <w:spacing w:after="80"/>
+      </w:pPr>
+      <w:r>
+        <w:rPr>
+          <w:rFonts w:ascii="Calibri" w:hAnsi="Calibri"/>
+          <w:b w:val="0"/>
+          <w:i w:val="0"/>
+          <w:sz w:val="20"/>
+        </w:rPr>
+        <w:t>Only 22 of 1,497 segments (1.5%) are boundary disagreements. 19 have LLM=Y but IS&lt;3.0 (validating the salvage analysis), and just 3 have LLM=N but IS≥3.0. The IS threshold is well-calibrated.</w:t>
+      </w:r>
+    </w:p>
+    <w:p>
+      <w:pPr>
+        <w:pStyle w:val="Heading2"/>
+      </w:pPr>
+      <w:r>
+        <w:rPr>
+          <w:rFonts w:ascii="Calibri" w:hAnsi="Calibri"/>
+          <w:color w:val="2A5A8C"/>
+        </w:rPr>
+        <w:t>17.4 LLM Judgment × IS Tier Distribution</w:t>
+      </w:r>
+    </w:p>
+    <w:p>
+      <w:pPr>
+        <w:spacing w:after="80"/>
+      </w:pPr>
+      <w:r>
+        <w:rPr>
+          <w:rFonts w:ascii="Calibri" w:hAnsi="Calibri"/>
+          <w:b w:val="0"/>
+          <w:i w:val="0"/>
+          <w:sz w:val="20"/>
+        </w:rPr>
+        <w:t>The 3×5 confusion matrix shows clean tier separation — Y concentrates in tiers 4–5, N in tiers 1–2, and P spans the middle:</w:t>
+      </w:r>
+    </w:p>
+    <w:tbl>
+      <w:tblPr>
+        <w:tblStyle w:val="TableGrid"/>
+        <w:tblW w:type="auto" w:w="0"/>
+        <w:jc w:val="center"/>
+        <w:tblLook w:firstColumn="1" w:firstRow="1" w:lastColumn="0" w:lastRow="0" w:noHBand="0" w:noVBand="1" w:val="04A0"/>
+      </w:tblPr>
+      <w:tblGrid>
+        <w:gridCol w:w="2268"/>
+        <w:gridCol w:w="2268"/>
+        <w:gridCol w:w="2268"/>
+        <w:gridCol w:w="2268"/>
+      </w:tblGrid>
+      <w:tr>
+        <w:tc>
+          <w:tcPr>
+            <w:tcW w:type="dxa" w:w="3168"/>
+            <w:shd w:fill="1a3a5c"/>
+          </w:tcPr>
+          <w:p>
+            <w:r/>
+            <w:r>
+              <w:rPr>
+                <w:rFonts w:ascii="Calibri" w:hAnsi="Calibri"/>
+                <w:b/>
+                <w:color w:val="FFFFFF"/>
+                <w:sz w:val="16"/>
+              </w:rPr>
+              <w:t>IS Tier</w:t>
+            </w:r>
+          </w:p>
+        </w:tc>
+        <w:tc>
+          <w:tcPr>
+            <w:tcW w:type="dxa" w:w="1728"/>
+            <w:shd w:fill="1a3a5c"/>
+          </w:tcPr>
+          <w:p>
+            <w:r/>
+            <w:r>
+              <w:rPr>
+                <w:rFonts w:ascii="Calibri" w:hAnsi="Calibri"/>
+                <w:b/>
+                <w:color w:val="FFFFFF"/>
+                <w:sz w:val="16"/>
+              </w:rPr>
+              <w:t>Y</w:t>
+            </w:r>
+          </w:p>
+        </w:tc>
+        <w:tc>
+          <w:tcPr>
+            <w:tcW w:type="dxa" w:w="1728"/>
+            <w:shd w:fill="1a3a5c"/>
+          </w:tcPr>
+          <w:p>
+            <w:r/>
+            <w:r>
+              <w:rPr>
+                <w:rFonts w:ascii="Calibri" w:hAnsi="Calibri"/>
+                <w:b/>
+                <w:color w:val="FFFFFF"/>
+                <w:sz w:val="16"/>
+              </w:rPr>
+              <w:t>P</w:t>
+            </w:r>
+          </w:p>
+        </w:tc>
+        <w:tc>
+          <w:tcPr>
+            <w:tcW w:type="dxa" w:w="1728"/>
+            <w:shd w:fill="1a3a5c"/>
+          </w:tcPr>
+          <w:p>
+            <w:r/>
+            <w:r>
+              <w:rPr>
+                <w:rFonts w:ascii="Calibri" w:hAnsi="Calibri"/>
+                <w:b/>
+                <w:color w:val="FFFFFF"/>
+                <w:sz w:val="16"/>
+              </w:rPr>
+              <w:t>N</w:t>
+            </w:r>
+          </w:p>
+        </w:tc>
+      </w:tr>
+      <w:tr>
+        <w:tc>
+          <w:tcPr>
+            <w:tcW w:type="dxa" w:w="3168"/>
+          </w:tcPr>
+          <w:p>
+            <w:r/>
+            <w:r>
+              <w:rPr>
+                <w:rFonts w:ascii="Calibri" w:hAnsi="Calibri"/>
+                <w:b w:val="0"/>
+                <w:sz w:val="16"/>
+              </w:rPr>
+              <w:t>5 — Excellent (4.0–5.0)</w:t>
+            </w:r>
+          </w:p>
+        </w:tc>
+        <w:tc>
+          <w:tcPr>
+            <w:tcW w:type="dxa" w:w="1728"/>
+          </w:tcPr>
+          <w:p>
+            <w:r/>
+            <w:r>
+              <w:rPr>
+                <w:rFonts w:ascii="Calibri" w:hAnsi="Calibri"/>
+                <w:b w:val="0"/>
+                <w:sz w:val="16"/>
+              </w:rPr>
+              <w:t>214 (62.0%)</w:t>
+            </w:r>
+          </w:p>
+        </w:tc>
+        <w:tc>
+          <w:tcPr>
+            <w:tcW w:type="dxa" w:w="1728"/>
+          </w:tcPr>
+          <w:p>
+            <w:r/>
+            <w:r>
+              <w:rPr>
+                <w:rFonts w:ascii="Calibri" w:hAnsi="Calibri"/>
+                <w:b w:val="0"/>
+                <w:sz w:val="16"/>
+              </w:rPr>
+              <w:t>56 (8.9%)</w:t>
+            </w:r>
+          </w:p>
+        </w:tc>
+        <w:tc>
+          <w:tcPr>
+            <w:tcW w:type="dxa" w:w="1728"/>
+          </w:tcPr>
+          <w:p>
+            <w:r/>
+            <w:r>
+              <w:rPr>
+                <w:rFonts w:ascii="Calibri" w:hAnsi="Calibri"/>
+                <w:b w:val="0"/>
+                <w:sz w:val="16"/>
+              </w:rPr>
+              <w:t>6 (1.1%)</w:t>
+            </w:r>
+          </w:p>
+        </w:tc>
+      </w:tr>
+      <w:tr>
+        <w:tc>
+          <w:tcPr>
+            <w:tcW w:type="dxa" w:w="3168"/>
+            <w:shd w:fill="f0f4f8"/>
+          </w:tcPr>
+          <w:p>
+            <w:r/>
+            <w:r>
+              <w:rPr>
+                <w:rFonts w:ascii="Calibri" w:hAnsi="Calibri"/>
+                <w:b w:val="0"/>
+                <w:sz w:val="16"/>
+              </w:rPr>
+              <w:t>4 — Good (3.0–3.99)</w:t>
+            </w:r>
+          </w:p>
+        </w:tc>
+        <w:tc>
+          <w:tcPr>
+            <w:tcW w:type="dxa" w:w="1728"/>
+            <w:shd w:fill="f0f4f8"/>
+          </w:tcPr>
+          <w:p>
+            <w:r/>
+            <w:r>
+              <w:rPr>
+                <w:rFonts w:ascii="Calibri" w:hAnsi="Calibri"/>
+                <w:b w:val="0"/>
+                <w:sz w:val="16"/>
+              </w:rPr>
+              <w:t>112 (32.5%)</w:t>
+            </w:r>
+          </w:p>
+        </w:tc>
+        <w:tc>
+          <w:tcPr>
+            <w:tcW w:type="dxa" w:w="1728"/>
+            <w:shd w:fill="f0f4f8"/>
+          </w:tcPr>
+          <w:p>
+            <w:r/>
+            <w:r>
+              <w:rPr>
+                <w:rFonts w:ascii="Calibri" w:hAnsi="Calibri"/>
+                <w:b w:val="0"/>
+                <w:sz w:val="16"/>
+              </w:rPr>
+              <w:t>179 (28.6%)</w:t>
+            </w:r>
+          </w:p>
+        </w:tc>
+        <w:tc>
+          <w:tcPr>
+            <w:tcW w:type="dxa" w:w="1728"/>
+            <w:shd w:fill="f0f4f8"/>
+          </w:tcPr>
+          <w:p>
+            <w:r/>
+            <w:r>
+              <w:rPr>
+                <w:rFonts w:ascii="Calibri" w:hAnsi="Calibri"/>
+                <w:b w:val="0"/>
+                <w:sz w:val="16"/>
+              </w:rPr>
+              <w:t>30 (5.7%)</w:t>
+            </w:r>
+          </w:p>
+        </w:tc>
+      </w:tr>
+      <w:tr>
+        <w:tc>
+          <w:tcPr>
+            <w:tcW w:type="dxa" w:w="3168"/>
+          </w:tcPr>
+          <w:p>
+            <w:r/>
+            <w:r>
+              <w:rPr>
+                <w:rFonts w:ascii="Calibri" w:hAnsi="Calibri"/>
+                <w:b w:val="0"/>
+                <w:sz w:val="16"/>
+              </w:rPr>
+              <w:t>3 — Fair (2.0–2.99)</w:t>
+            </w:r>
+          </w:p>
+        </w:tc>
+        <w:tc>
+          <w:tcPr>
+            <w:tcW w:type="dxa" w:w="1728"/>
+          </w:tcPr>
+          <w:p>
+            <w:r/>
+            <w:r>
+              <w:rPr>
+                <w:rFonts w:ascii="Calibri" w:hAnsi="Calibri"/>
+                <w:b w:val="0"/>
+                <w:sz w:val="16"/>
+              </w:rPr>
+              <w:t>14 (4.1%)</w:t>
+            </w:r>
+          </w:p>
+        </w:tc>
+        <w:tc>
+          <w:tcPr>
+            <w:tcW w:type="dxa" w:w="1728"/>
+          </w:tcPr>
+          <w:p>
+            <w:r/>
+            <w:r>
+              <w:rPr>
+                <w:rFonts w:ascii="Calibri" w:hAnsi="Calibri"/>
+                <w:b w:val="0"/>
+                <w:sz w:val="16"/>
+              </w:rPr>
+              <w:t>206 (32.9%)</w:t>
+            </w:r>
+          </w:p>
+        </w:tc>
+        <w:tc>
+          <w:tcPr>
+            <w:tcW w:type="dxa" w:w="1728"/>
+          </w:tcPr>
+          <w:p>
+            <w:r/>
+            <w:r>
+              <w:rPr>
+                <w:rFonts w:ascii="Calibri" w:hAnsi="Calibri"/>
+                <w:b w:val="0"/>
+                <w:sz w:val="16"/>
+              </w:rPr>
+              <w:t>105 (20.0%)</w:t>
+            </w:r>
+          </w:p>
+        </w:tc>
+      </w:tr>
+      <w:tr>
+        <w:tc>
+          <w:tcPr>
+            <w:tcW w:type="dxa" w:w="3168"/>
+            <w:shd w:fill="f0f4f8"/>
+          </w:tcPr>
+          <w:p>
+            <w:r/>
+            <w:r>
+              <w:rPr>
+                <w:rFonts w:ascii="Calibri" w:hAnsi="Calibri"/>
+                <w:b w:val="0"/>
+                <w:sz w:val="16"/>
+              </w:rPr>
+              <w:t>2 — Poor (1.0–1.99)</w:t>
+            </w:r>
+          </w:p>
+        </w:tc>
+        <w:tc>
+          <w:tcPr>
+            <w:tcW w:type="dxa" w:w="1728"/>
+            <w:shd w:fill="f0f4f8"/>
+          </w:tcPr>
+          <w:p>
+            <w:r/>
+            <w:r>
+              <w:rPr>
+                <w:rFonts w:ascii="Calibri" w:hAnsi="Calibri"/>
+                <w:b w:val="0"/>
+                <w:sz w:val="16"/>
+              </w:rPr>
+              <w:t>5 (1.4%)</w:t>
+            </w:r>
+          </w:p>
+        </w:tc>
+        <w:tc>
+          <w:tcPr>
+            <w:tcW w:type="dxa" w:w="1728"/>
+            <w:shd w:fill="f0f4f8"/>
+          </w:tcPr>
+          <w:p>
+            <w:r/>
+            <w:r>
+              <w:rPr>
+                <w:rFonts w:ascii="Calibri" w:hAnsi="Calibri"/>
+                <w:b w:val="0"/>
+                <w:sz w:val="16"/>
+              </w:rPr>
+              <w:t>152 (24.3%)</w:t>
+            </w:r>
+          </w:p>
+        </w:tc>
+        <w:tc>
+          <w:tcPr>
+            <w:tcW w:type="dxa" w:w="1728"/>
+            <w:shd w:fill="f0f4f8"/>
+          </w:tcPr>
+          <w:p>
+            <w:r/>
+            <w:r>
+              <w:rPr>
+                <w:rFonts w:ascii="Calibri" w:hAnsi="Calibri"/>
+                <w:b w:val="0"/>
+                <w:sz w:val="16"/>
+              </w:rPr>
+              <w:t>179 (34.0%)</w:t>
+            </w:r>
+          </w:p>
+        </w:tc>
+      </w:tr>
+      <w:tr>
+        <w:tc>
+          <w:tcPr>
+            <w:tcW w:type="dxa" w:w="3168"/>
+          </w:tcPr>
+          <w:p>
+            <w:r/>
+            <w:r>
+              <w:rPr>
+                <w:rFonts w:ascii="Calibri" w:hAnsi="Calibri"/>
+                <w:b w:val="0"/>
+                <w:sz w:val="16"/>
+              </w:rPr>
+              <w:t>1 — Failed (0.0–0.99)</w:t>
+            </w:r>
+          </w:p>
+        </w:tc>
+        <w:tc>
+          <w:tcPr>
+            <w:tcW w:type="dxa" w:w="1728"/>
+          </w:tcPr>
+          <w:p>
+            <w:r/>
+            <w:r>
+              <w:rPr>
+                <w:rFonts w:ascii="Calibri" w:hAnsi="Calibri"/>
+                <w:b w:val="0"/>
+                <w:sz w:val="16"/>
+              </w:rPr>
+              <w:t>0 (0.0%)</w:t>
+            </w:r>
+          </w:p>
+        </w:tc>
+        <w:tc>
+          <w:tcPr>
+            <w:tcW w:type="dxa" w:w="1728"/>
+          </w:tcPr>
+          <w:p>
+            <w:r/>
+            <w:r>
+              <w:rPr>
+                <w:rFonts w:ascii="Calibri" w:hAnsi="Calibri"/>
+                <w:b w:val="0"/>
+                <w:sz w:val="16"/>
+              </w:rPr>
+              <w:t>33 (5.3%)</w:t>
+            </w:r>
+          </w:p>
+        </w:tc>
+        <w:tc>
+          <w:tcPr>
+            <w:tcW w:type="dxa" w:w="1728"/>
+          </w:tcPr>
+          <w:p>
+            <w:r/>
+            <w:r>
+              <w:rPr>
+                <w:rFonts w:ascii="Calibri" w:hAnsi="Calibri"/>
+                <w:b w:val="0"/>
+                <w:sz w:val="16"/>
+              </w:rPr>
+              <w:t>206 (39.2%)</w:t>
+            </w:r>
+          </w:p>
+        </w:tc>
+      </w:tr>
+    </w:tbl>
+    <w:p/>
+    <w:p>
+      <w:pPr>
+        <w:pStyle w:val="Heading2"/>
+      </w:pPr>
+      <w:r>
+        <w:rPr>
+          <w:rFonts w:ascii="Calibri" w:hAnsi="Calibri"/>
+          <w:color w:val="2A5A8C"/>
+        </w:rPr>
+        <w:t>17.5 Partial Judgment Analysis (626 P Segments)</w:t>
+      </w:r>
+    </w:p>
+    <w:tbl>
+      <w:tblPr>
+        <w:tblStyle w:val="TableGrid"/>
+        <w:tblW w:type="auto" w:w="0"/>
+        <w:jc w:val="center"/>
+        <w:tblLook w:firstColumn="1" w:firstRow="1" w:lastColumn="0" w:lastRow="0" w:noHBand="0" w:noVBand="1" w:val="04A0"/>
+      </w:tblPr>
+      <w:tblGrid>
+        <w:gridCol w:w="3024"/>
+        <w:gridCol w:w="3024"/>
+        <w:gridCol w:w="3024"/>
+      </w:tblGrid>
+      <w:tr>
+        <w:tc>
+          <w:tcPr>
+            <w:tcW w:type="dxa" w:w="3600"/>
+            <w:shd w:fill="1a3a5c"/>
+          </w:tcPr>
+          <w:p>
+            <w:r/>
+            <w:r>
+              <w:rPr>
+                <w:rFonts w:ascii="Calibri" w:hAnsi="Calibri"/>
+                <w:b/>
+                <w:color w:val="FFFFFF"/>
+                <w:sz w:val="16"/>
+              </w:rPr>
+              <w:t>Element</w:t>
+            </w:r>
+          </w:p>
+        </w:tc>
+        <w:tc>
+          <w:tcPr>
+            <w:tcW w:type="dxa" w:w="2160"/>
+            <w:shd w:fill="1a3a5c"/>
+          </w:tcPr>
+          <w:p>
+            <w:r/>
+            <w:r>
+              <w:rPr>
+                <w:rFonts w:ascii="Calibri" w:hAnsi="Calibri"/>
+                <w:b/>
+                <w:color w:val="FFFFFF"/>
+                <w:sz w:val="16"/>
+              </w:rPr>
+              <w:t>Preserved (% of P)</w:t>
+            </w:r>
+          </w:p>
+        </w:tc>
+        <w:tc>
+          <w:tcPr>
+            <w:tcW w:type="dxa" w:w="2160"/>
+            <w:shd w:fill="1a3a5c"/>
+          </w:tcPr>
+          <w:p>
+            <w:r/>
+            <w:r>
+              <w:rPr>
+                <w:rFonts w:ascii="Calibri" w:hAnsi="Calibri"/>
+                <w:b/>
+                <w:color w:val="FFFFFF"/>
+                <w:sz w:val="16"/>
+              </w:rPr>
+              <w:t>Lost (% of P)</w:t>
+            </w:r>
+          </w:p>
+        </w:tc>
+      </w:tr>
+      <w:tr>
+        <w:tc>
+          <w:tcPr>
+            <w:tcW w:type="dxa" w:w="3600"/>
+          </w:tcPr>
+          <w:p>
+            <w:r/>
+            <w:r>
+              <w:rPr>
+                <w:rFonts w:ascii="Calibri" w:hAnsi="Calibri"/>
+                <w:b w:val="0"/>
+                <w:sz w:val="16"/>
+              </w:rPr>
+              <w:t>Structure (word order, grammar)</w:t>
+            </w:r>
+          </w:p>
+        </w:tc>
+        <w:tc>
+          <w:tcPr>
+            <w:tcW w:type="dxa" w:w="2160"/>
+          </w:tcPr>
+          <w:p>
+            <w:r/>
+            <w:r>
+              <w:rPr>
+                <w:rFonts w:ascii="Calibri" w:hAnsi="Calibri"/>
+                <w:b w:val="0"/>
+                <w:sz w:val="16"/>
+              </w:rPr>
+              <w:t>88.8%</w:t>
+            </w:r>
+          </w:p>
+        </w:tc>
+        <w:tc>
+          <w:tcPr>
+            <w:tcW w:type="dxa" w:w="2160"/>
+          </w:tcPr>
+          <w:p>
+            <w:r/>
+            <w:r>
+              <w:rPr>
+                <w:rFonts w:ascii="Calibri" w:hAnsi="Calibri"/>
+                <w:b w:val="0"/>
+                <w:sz w:val="16"/>
+              </w:rPr>
+              <w:t>0.6%</w:t>
+            </w:r>
+          </w:p>
+        </w:tc>
+      </w:tr>
+      <w:tr>
+        <w:tc>
+          <w:tcPr>
+            <w:tcW w:type="dxa" w:w="3600"/>
+            <w:shd w:fill="f0f4f8"/>
+          </w:tcPr>
+          <w:p>
+            <w:r/>
+            <w:r>
+              <w:rPr>
+                <w:rFonts w:ascii="Calibri" w:hAnsi="Calibri"/>
+                <w:b w:val="0"/>
+                <w:sz w:val="16"/>
+              </w:rPr>
+              <w:t>Key content words</w:t>
+            </w:r>
+          </w:p>
+        </w:tc>
+        <w:tc>
+          <w:tcPr>
+            <w:tcW w:type="dxa" w:w="2160"/>
+            <w:shd w:fill="f0f4f8"/>
+          </w:tcPr>
+          <w:p>
+            <w:r/>
+            <w:r>
+              <w:rPr>
+                <w:rFonts w:ascii="Calibri" w:hAnsi="Calibri"/>
+                <w:b w:val="0"/>
+                <w:sz w:val="16"/>
+              </w:rPr>
+              <w:t>66.6%</w:t>
+            </w:r>
+          </w:p>
+        </w:tc>
+        <w:tc>
+          <w:tcPr>
+            <w:tcW w:type="dxa" w:w="2160"/>
+            <w:shd w:fill="f0f4f8"/>
+          </w:tcPr>
+          <w:p>
+            <w:r/>
+            <w:r>
+              <w:rPr>
+                <w:rFonts w:ascii="Calibri" w:hAnsi="Calibri"/>
+                <w:b w:val="0"/>
+                <w:sz w:val="16"/>
+              </w:rPr>
+              <w:t>25.6%</w:t>
+            </w:r>
+          </w:p>
+        </w:tc>
+      </w:tr>
+      <w:tr>
+        <w:tc>
+          <w:tcPr>
+            <w:tcW w:type="dxa" w:w="3600"/>
+          </w:tcPr>
+          <w:p>
+            <w:r/>
+            <w:r>
+              <w:rPr>
+                <w:rFonts w:ascii="Calibri" w:hAnsi="Calibri"/>
+                <w:b w:val="0"/>
+                <w:sz w:val="16"/>
+              </w:rPr>
+              <w:t>Semantic meaning / gist</w:t>
+            </w:r>
+          </w:p>
+        </w:tc>
+        <w:tc>
+          <w:tcPr>
+            <w:tcW w:type="dxa" w:w="2160"/>
+          </w:tcPr>
+          <w:p>
+            <w:r/>
+            <w:r>
+              <w:rPr>
+                <w:rFonts w:ascii="Calibri" w:hAnsi="Calibri"/>
+                <w:b w:val="0"/>
+                <w:sz w:val="16"/>
+              </w:rPr>
+              <w:t>26.0%</w:t>
+            </w:r>
+          </w:p>
+        </w:tc>
+        <w:tc>
+          <w:tcPr>
+            <w:tcW w:type="dxa" w:w="2160"/>
+          </w:tcPr>
+          <w:p>
+            <w:r/>
+            <w:r>
+              <w:rPr>
+                <w:rFonts w:ascii="Calibri" w:hAnsi="Calibri"/>
+                <w:b w:val="0"/>
+                <w:sz w:val="16"/>
+              </w:rPr>
+              <w:t>55.1%</w:t>
+            </w:r>
+          </w:p>
+        </w:tc>
+      </w:tr>
+      <w:tr>
+        <w:tc>
+          <w:tcPr>
+            <w:tcW w:type="dxa" w:w="3600"/>
+            <w:shd w:fill="f0f4f8"/>
+          </w:tcPr>
+          <w:p>
+            <w:r/>
+            <w:r>
+              <w:rPr>
+                <w:rFonts w:ascii="Calibri" w:hAnsi="Calibri"/>
+                <w:b w:val="0"/>
+                <w:sz w:val="16"/>
+              </w:rPr>
+              <w:t>Detail / qualifiers</w:t>
+            </w:r>
+          </w:p>
+        </w:tc>
+        <w:tc>
+          <w:tcPr>
+            <w:tcW w:type="dxa" w:w="2160"/>
+            <w:shd w:fill="f0f4f8"/>
+          </w:tcPr>
+          <w:p>
+            <w:r/>
+            <w:r>
+              <w:rPr>
+                <w:rFonts w:ascii="Calibri" w:hAnsi="Calibri"/>
+                <w:b w:val="0"/>
+                <w:sz w:val="16"/>
+              </w:rPr>
+              <w:t>—</w:t>
+            </w:r>
+          </w:p>
+        </w:tc>
+        <w:tc>
+          <w:tcPr>
+            <w:tcW w:type="dxa" w:w="2160"/>
+            <w:shd w:fill="f0f4f8"/>
+          </w:tcPr>
+          <w:p>
+            <w:r/>
+            <w:r>
+              <w:rPr>
+                <w:rFonts w:ascii="Calibri" w:hAnsi="Calibri"/>
+                <w:b w:val="0"/>
+                <w:sz w:val="16"/>
+              </w:rPr>
+              <w:t>55.4%</w:t>
+            </w:r>
+          </w:p>
+        </w:tc>
+      </w:tr>
+      <w:tr>
+        <w:tc>
+          <w:tcPr>
+            <w:tcW w:type="dxa" w:w="3600"/>
+          </w:tcPr>
+          <w:p>
+            <w:r/>
+            <w:r>
+              <w:rPr>
+                <w:rFonts w:ascii="Calibri" w:hAnsi="Calibri"/>
+                <w:b w:val="0"/>
+                <w:sz w:val="16"/>
+              </w:rPr>
+              <w:t>Named entities</w:t>
+            </w:r>
+          </w:p>
+        </w:tc>
+        <w:tc>
+          <w:tcPr>
+            <w:tcW w:type="dxa" w:w="2160"/>
+          </w:tcPr>
+          <w:p>
+            <w:r/>
+            <w:r>
+              <w:rPr>
+                <w:rFonts w:ascii="Calibri" w:hAnsi="Calibri"/>
+                <w:b w:val="0"/>
+                <w:sz w:val="16"/>
+              </w:rPr>
+              <w:t>0.6%</w:t>
+            </w:r>
+          </w:p>
+        </w:tc>
+        <w:tc>
+          <w:tcPr>
+            <w:tcW w:type="dxa" w:w="2160"/>
+          </w:tcPr>
+          <w:p>
+            <w:r/>
+            <w:r>
+              <w:rPr>
+                <w:rFonts w:ascii="Calibri" w:hAnsi="Calibri"/>
+                <w:b w:val="0"/>
+                <w:sz w:val="16"/>
+              </w:rPr>
+              <w:t>20.6%</w:t>
+            </w:r>
+          </w:p>
+        </w:tc>
+      </w:tr>
+      <w:tr>
+        <w:tc>
+          <w:tcPr>
+            <w:tcW w:type="dxa" w:w="3600"/>
+            <w:shd w:fill="f0f4f8"/>
+          </w:tcPr>
+          <w:p>
+            <w:r/>
+            <w:r>
+              <w:rPr>
+                <w:rFonts w:ascii="Calibri" w:hAnsi="Calibri"/>
+                <w:b w:val="0"/>
+                <w:sz w:val="16"/>
+              </w:rPr>
+              <w:t>Phonetic resemblance</w:t>
+            </w:r>
+          </w:p>
+        </w:tc>
+        <w:tc>
+          <w:tcPr>
+            <w:tcW w:type="dxa" w:w="2160"/>
+            <w:shd w:fill="f0f4f8"/>
+          </w:tcPr>
+          <w:p>
+            <w:r/>
+            <w:r>
+              <w:rPr>
+                <w:rFonts w:ascii="Calibri" w:hAnsi="Calibri"/>
+                <w:b w:val="0"/>
+                <w:sz w:val="16"/>
+              </w:rPr>
+              <w:t>16.6%</w:t>
+            </w:r>
+          </w:p>
+        </w:tc>
+        <w:tc>
+          <w:tcPr>
+            <w:tcW w:type="dxa" w:w="2160"/>
+            <w:shd w:fill="f0f4f8"/>
+          </w:tcPr>
+          <w:p>
+            <w:r/>
+            <w:r>
+              <w:rPr>
+                <w:rFonts w:ascii="Calibri" w:hAnsi="Calibri"/>
+                <w:b w:val="0"/>
+                <w:sz w:val="16"/>
+              </w:rPr>
+              <w:t>—</w:t>
+            </w:r>
+          </w:p>
+        </w:tc>
+      </w:tr>
+    </w:tbl>
+    <w:p/>
+    <w:p>
+      <w:pPr>
+        <w:spacing w:after="80"/>
+      </w:pPr>
+      <w:r>
+        <w:rPr>
+          <w:rFonts w:ascii="Calibri" w:hAnsi="Calibri"/>
+          <w:b w:val="0"/>
+          <w:i w:val="0"/>
+          <w:sz w:val="20"/>
+        </w:rPr>
+        <w:t>The model reliably produces grammatically well-formed output with recognizable content words, but frequently loses specific meaning, fine-grained detail, and named entities.</w:t>
+      </w:r>
+    </w:p>
+    <w:p>
+      <w:pPr>
+        <w:pStyle w:val="Heading2"/>
+      </w:pPr>
+      <w:r>
+        <w:rPr>
+          <w:rFonts w:ascii="Calibri" w:hAnsi="Calibri"/>
+          <w:color w:val="2A5A8C"/>
+        </w:rPr>
+        <w:t>17.6 Cross-Configuration Stability</w:t>
+      </w:r>
+    </w:p>
+    <w:p>
+      <w:pPr>
+        <w:spacing w:after="80"/>
+      </w:pPr>
+      <w:r>
+        <w:rPr>
+          <w:rFonts w:ascii="Calibri" w:hAnsi="Calibri"/>
+          <w:b w:val="0"/>
+          <w:i w:val="0"/>
+          <w:sz w:val="20"/>
+        </w:rPr>
+        <w:t>The llm_context_prob heuristic (a deterministic decision tree, not an LLM API call) was validated across 16 decode configurations:</w:t>
+      </w:r>
+    </w:p>
+    <w:p>
+      <w:pPr>
+        <w:pStyle w:val="ListBullet"/>
+        <w:spacing w:after="40"/>
+        <w:ind w:left="360"/>
+      </w:pPr>
+      <w:r>
+        <w:rPr>
+          <w:rFonts w:ascii="Calibri" w:hAnsi="Calibri"/>
+          <w:b/>
+          <w:sz w:val="18"/>
+        </w:rPr>
+        <w:t xml:space="preserve">Mean correlation with IS: </w:t>
+      </w:r>
+      <w:r>
+        <w:rPr>
+          <w:rFonts w:ascii="Calibri" w:hAnsi="Calibri"/>
+          <w:sz w:val="18"/>
+        </w:rPr>
+        <w:t>r = 0.925 (std = 0.015)</w:t>
+      </w:r>
+    </w:p>
+    <w:p>
+      <w:pPr>
+        <w:pStyle w:val="ListBullet"/>
+        <w:spacing w:after="40"/>
+        <w:ind w:left="360"/>
+      </w:pPr>
+      <w:r>
+        <w:rPr>
+          <w:rFonts w:ascii="Calibri" w:hAnsi="Calibri"/>
+          <w:b/>
+          <w:sz w:val="18"/>
+        </w:rPr>
+        <w:t xml:space="preserve">Cohen’s κ range: </w:t>
+      </w:r>
+      <w:r>
+        <w:rPr>
+          <w:rFonts w:ascii="Calibri" w:hAnsi="Calibri"/>
+          <w:sz w:val="18"/>
+        </w:rPr>
+        <w:t>0.62–0.86 across configs</w:t>
+      </w:r>
+    </w:p>
+    <w:p>
+      <w:pPr>
+        <w:pStyle w:val="ListBullet"/>
+        <w:spacing w:after="40"/>
+        <w:ind w:left="360"/>
+      </w:pPr>
+      <w:r>
+        <w:rPr>
+          <w:rFonts w:ascii="Calibri" w:hAnsi="Calibri"/>
+          <w:b/>
+          <w:sz w:val="18"/>
+        </w:rPr>
+        <w:t xml:space="preserve">Recall for IS ≥ 3.0: </w:t>
+      </w:r>
+      <w:r>
+        <w:rPr>
+          <w:rFonts w:ascii="Calibri" w:hAnsi="Calibri"/>
+          <w:sz w:val="18"/>
+        </w:rPr>
+        <w:t>97.6–100% across all configs</w:t>
+      </w:r>
+    </w:p>
+    <w:p>
+      <w:pPr>
+        <w:pStyle w:val="ListBullet"/>
+        <w:spacing w:after="40"/>
+        <w:ind w:left="360"/>
+      </w:pPr>
+      <w:r>
+        <w:rPr>
+          <w:rFonts w:ascii="Calibri" w:hAnsi="Calibri"/>
+          <w:b/>
+          <w:sz w:val="18"/>
+        </w:rPr>
+        <w:t xml:space="preserve">Agreement with IS ≥ 3.0: </w:t>
+      </w:r>
+      <w:r>
+        <w:rPr>
+          <w:rFonts w:ascii="Calibri" w:hAnsi="Calibri"/>
+          <w:sz w:val="18"/>
+        </w:rPr>
+        <w:t>88.6% (1,325/1,497 segments)</w:t>
+      </w:r>
+    </w:p>
+    <w:p>
+      <w:pPr>
+        <w:spacing w:after="80"/>
+      </w:pPr>
+      <w:r>
+        <w:rPr>
+          <w:rFonts w:ascii="Calibri" w:hAnsi="Calibri"/>
+          <w:b w:val="0"/>
+          <w:i w:val="0"/>
+          <w:sz w:val="20"/>
+        </w:rPr>
+        <w:t>This stability confirms the IS framework measures a genuine underlying quality dimension that persists regardless of decode settings, and that the LLM judge’s holistic assessment tracks this dimension faithfully.</w:t>
+      </w:r>
+    </w:p>
+    <w:p>
+      <w:pPr>
+        <w:pStyle w:val="Heading2"/>
+      </w:pPr>
+      <w:r>
+        <w:rPr>
+          <w:rFonts w:ascii="Calibri" w:hAnsi="Calibri"/>
+          <w:color w:val="2A5A8C"/>
+        </w:rPr>
+        <w:t>17.7 Capture Rate Comparison</w:t>
+      </w:r>
+    </w:p>
+    <w:tbl>
+      <w:tblPr>
+        <w:tblStyle w:val="TableGrid"/>
+        <w:tblW w:type="auto" w:w="0"/>
+        <w:jc w:val="center"/>
+        <w:tblLook w:firstColumn="1" w:firstRow="1" w:lastColumn="0" w:lastRow="0" w:noHBand="0" w:noVBand="1" w:val="04A0"/>
+      </w:tblPr>
+      <w:tblGrid>
+        <w:gridCol w:w="3024"/>
+        <w:gridCol w:w="3024"/>
+        <w:gridCol w:w="3024"/>
+      </w:tblGrid>
+      <w:tr>
+        <w:tc>
+          <w:tcPr>
+            <w:tcW w:type="dxa" w:w="3312"/>
+            <w:shd w:fill="1a3a5c"/>
+          </w:tcPr>
+          <w:p>
+            <w:r/>
+            <w:r>
+              <w:rPr>
+                <w:rFonts w:ascii="Calibri" w:hAnsi="Calibri"/>
+                <w:b/>
+                <w:color w:val="FFFFFF"/>
+                <w:sz w:val="16"/>
+              </w:rPr>
+              <w:t>Method</w:t>
+            </w:r>
+          </w:p>
+        </w:tc>
+        <w:tc>
+          <w:tcPr>
+            <w:tcW w:type="dxa" w:w="1440"/>
+            <w:shd w:fill="1a3a5c"/>
+          </w:tcPr>
+          <w:p>
+            <w:r/>
+            <w:r>
+              <w:rPr>
+                <w:rFonts w:ascii="Calibri" w:hAnsi="Calibri"/>
+                <w:b/>
+                <w:color w:val="FFFFFF"/>
+                <w:sz w:val="16"/>
+              </w:rPr>
+              <w:t>Capture Rate</w:t>
+            </w:r>
+          </w:p>
+        </w:tc>
+        <w:tc>
+          <w:tcPr>
+            <w:tcW w:type="dxa" w:w="4608"/>
+            <w:shd w:fill="1a3a5c"/>
+          </w:tcPr>
+          <w:p>
+            <w:r/>
+            <w:r>
+              <w:rPr>
+                <w:rFonts w:ascii="Calibri" w:hAnsi="Calibri"/>
+                <w:b/>
+                <w:color w:val="FFFFFF"/>
+                <w:sz w:val="16"/>
+              </w:rPr>
+              <w:t>What It Measures</w:t>
+            </w:r>
+          </w:p>
+        </w:tc>
+      </w:tr>
+      <w:tr>
+        <w:tc>
+          <w:tcPr>
+            <w:tcW w:type="dxa" w:w="3312"/>
+          </w:tcPr>
+          <w:p>
+            <w:r/>
+            <w:r>
+              <w:rPr>
+                <w:rFonts w:ascii="Calibri" w:hAnsi="Calibri"/>
+                <w:b w:val="0"/>
+                <w:sz w:val="16"/>
+              </w:rPr>
+              <w:t>WER ≤ 20%</w:t>
+            </w:r>
+          </w:p>
+        </w:tc>
+        <w:tc>
+          <w:tcPr>
+            <w:tcW w:type="dxa" w:w="1440"/>
+          </w:tcPr>
+          <w:p>
+            <w:r/>
+            <w:r>
+              <w:rPr>
+                <w:rFonts w:ascii="Calibri" w:hAnsi="Calibri"/>
+                <w:b w:val="0"/>
+                <w:sz w:val="16"/>
+              </w:rPr>
+              <w:t>11.4%</w:t>
+            </w:r>
+          </w:p>
+        </w:tc>
+        <w:tc>
+          <w:tcPr>
+            <w:tcW w:type="dxa" w:w="4608"/>
+          </w:tcPr>
+          <w:p>
+            <w:r/>
+            <w:r>
+              <w:rPr>
+                <w:rFonts w:ascii="Calibri" w:hAnsi="Calibri"/>
+                <w:b w:val="0"/>
+                <w:sz w:val="16"/>
+              </w:rPr>
+              <w:t>Traditional word accuracy only</w:t>
+            </w:r>
+          </w:p>
+        </w:tc>
+      </w:tr>
+      <w:tr>
+        <w:tc>
+          <w:tcPr>
+            <w:tcW w:type="dxa" w:w="3312"/>
+            <w:shd w:fill="f0f4f8"/>
+          </w:tcPr>
+          <w:p>
+            <w:r/>
+            <w:r>
+              <w:rPr>
+                <w:rFonts w:ascii="Calibri" w:hAnsi="Calibri"/>
+                <w:b w:val="0"/>
+                <w:sz w:val="16"/>
+              </w:rPr>
+              <w:t>IS ≥ 3.0</w:t>
+            </w:r>
+          </w:p>
+        </w:tc>
+        <w:tc>
+          <w:tcPr>
+            <w:tcW w:type="dxa" w:w="1440"/>
+            <w:shd w:fill="f0f4f8"/>
+          </w:tcPr>
+          <w:p>
+            <w:r/>
+            <w:r>
+              <w:rPr>
+                <w:rFonts w:ascii="Calibri" w:hAnsi="Calibri"/>
+                <w:b w:val="0"/>
+                <w:sz w:val="16"/>
+              </w:rPr>
+              <w:t>39.9%</w:t>
+            </w:r>
+          </w:p>
+        </w:tc>
+        <w:tc>
+          <w:tcPr>
+            <w:tcW w:type="dxa" w:w="4608"/>
+            <w:shd w:fill="f0f4f8"/>
+          </w:tcPr>
+          <w:p>
+            <w:r/>
+            <w:r>
+              <w:rPr>
+                <w:rFonts w:ascii="Calibri" w:hAnsi="Calibri"/>
+                <w:b w:val="0"/>
+                <w:sz w:val="16"/>
+              </w:rPr>
+              <w:t>Multi-signal intelligibility</w:t>
+            </w:r>
+          </w:p>
+        </w:tc>
+      </w:tr>
+      <w:tr>
+        <w:tc>
+          <w:tcPr>
+            <w:tcW w:type="dxa" w:w="3312"/>
+          </w:tcPr>
+          <w:p>
+            <w:r/>
+            <w:r>
+              <w:rPr>
+                <w:rFonts w:ascii="Calibri" w:hAnsi="Calibri"/>
+                <w:b w:val="0"/>
+                <w:sz w:val="16"/>
+              </w:rPr>
+              <w:t>IS + salvage (llm_prob ≥ 0.5)</w:t>
+            </w:r>
+          </w:p>
+        </w:tc>
+        <w:tc>
+          <w:tcPr>
+            <w:tcW w:type="dxa" w:w="1440"/>
+          </w:tcPr>
+          <w:p>
+            <w:r/>
+            <w:r>
+              <w:rPr>
+                <w:rFonts w:ascii="Calibri" w:hAnsi="Calibri"/>
+                <w:b w:val="0"/>
+                <w:sz w:val="16"/>
+              </w:rPr>
+              <w:t>50.9%</w:t>
+            </w:r>
+          </w:p>
+        </w:tc>
+        <w:tc>
+          <w:tcPr>
+            <w:tcW w:type="dxa" w:w="4608"/>
+          </w:tcPr>
+          <w:p>
+            <w:r/>
+            <w:r>
+              <w:rPr>
+                <w:rFonts w:ascii="Calibri" w:hAnsi="Calibri"/>
+                <w:b w:val="0"/>
+                <w:sz w:val="16"/>
+              </w:rPr>
+              <w:t>IS + recoverable meaning</w:t>
+            </w:r>
+          </w:p>
+        </w:tc>
+      </w:tr>
+      <w:tr>
+        <w:tc>
+          <w:tcPr>
+            <w:tcW w:type="dxa" w:w="3312"/>
+            <w:shd w:fill="f0f4f8"/>
+          </w:tcPr>
+          <w:p>
+            <w:r/>
+            <w:r>
+              <w:rPr>
+                <w:rFonts w:ascii="Calibri" w:hAnsi="Calibri"/>
+                <w:b w:val="0"/>
+                <w:sz w:val="16"/>
+              </w:rPr>
+              <w:t>LLM Judge: Y</w:t>
+            </w:r>
+          </w:p>
+        </w:tc>
+        <w:tc>
+          <w:tcPr>
+            <w:tcW w:type="dxa" w:w="1440"/>
+            <w:shd w:fill="f0f4f8"/>
+          </w:tcPr>
+          <w:p>
+            <w:r/>
+            <w:r>
+              <w:rPr>
+                <w:rFonts w:ascii="Calibri" w:hAnsi="Calibri"/>
+                <w:b w:val="0"/>
+                <w:sz w:val="16"/>
+              </w:rPr>
+              <w:t>23.0%</w:t>
+            </w:r>
+          </w:p>
+        </w:tc>
+        <w:tc>
+          <w:tcPr>
+            <w:tcW w:type="dxa" w:w="4608"/>
+            <w:shd w:fill="f0f4f8"/>
+          </w:tcPr>
+          <w:p>
+            <w:r/>
+            <w:r>
+              <w:rPr>
+                <w:rFonts w:ascii="Calibri" w:hAnsi="Calibri"/>
+                <w:b w:val="0"/>
+                <w:sz w:val="16"/>
+              </w:rPr>
+              <w:t>Strict holistic meaning preservation</w:t>
+            </w:r>
+          </w:p>
+        </w:tc>
+      </w:tr>
+      <w:tr>
+        <w:tc>
+          <w:tcPr>
+            <w:tcW w:type="dxa" w:w="3312"/>
+          </w:tcPr>
+          <w:p>
+            <w:r/>
+            <w:r>
+              <w:rPr>
+                <w:rFonts w:ascii="Calibri" w:hAnsi="Calibri"/>
+                <w:b w:val="0"/>
+                <w:sz w:val="16"/>
+              </w:rPr>
+              <w:t>LLM Judge: Y+P</w:t>
+            </w:r>
+          </w:p>
+        </w:tc>
+        <w:tc>
+          <w:tcPr>
+            <w:tcW w:type="dxa" w:w="1440"/>
+          </w:tcPr>
+          <w:p>
+            <w:r/>
+            <w:r>
+              <w:rPr>
+                <w:rFonts w:ascii="Calibri" w:hAnsi="Calibri"/>
+                <w:b w:val="0"/>
+                <w:sz w:val="16"/>
+              </w:rPr>
+              <w:t>64.9%</w:t>
+            </w:r>
+          </w:p>
+        </w:tc>
+        <w:tc>
+          <w:tcPr>
+            <w:tcW w:type="dxa" w:w="4608"/>
+          </w:tcPr>
+          <w:p>
+            <w:r/>
+            <w:r>
+              <w:rPr>
+                <w:rFonts w:ascii="Calibri" w:hAnsi="Calibri"/>
+                <w:b w:val="0"/>
+                <w:sz w:val="16"/>
+              </w:rPr>
+              <w:t>Any useful output (holistic)</w:t>
+            </w:r>
+          </w:p>
+        </w:tc>
+      </w:tr>
+    </w:tbl>
+    <w:p/>
+    <w:p>
+      <w:pPr>
+        <w:spacing w:after="80"/>
+      </w:pPr>
+      <w:r>
+        <w:rPr>
+          <w:rFonts w:ascii="Calibri" w:hAnsi="Calibri"/>
+          <w:b/>
+          <w:i w:val="0"/>
+          <w:sz w:val="20"/>
+        </w:rPr>
+        <w:t>Key implication: WER alone reports 11.4% success; IS raises this to 39.9%; the LLM judge’s lenient threshold shows 64.9% of outputs contain at least some useful information. The true capture rate lies between IS (39.9%) and LLM Y+P (64.9%), depending on the downstream application’s tolerance for partial information.</w:t>
+      </w:r>
+    </w:p>
     <w:sectPr>
       <w:headerReference w:type="default" r:id="rId10"/>
       <w:footerReference w:type="default" r:id="rId11"/>

</xml_diff>